<commit_message>
auto: claude changes 11:53
</commit_message>
<xml_diff>
--- a/CAFlow_FullBook_FS_Assurance_Report_v8.docx
+++ b/CAFlow_FullBook_FS_Assurance_Report_v8.docx
@@ -5728,7 +5728,7 @@
           <w:sz w:val="32"/>
           <w:szCs w:val="32"/>
         </w:rPr>
-        <w:t xml:space="preserve">Section B — 4 new latent root causes (found by code audit, closed pre-emptively)</w:t>
+        <w:t xml:space="preserve">Section B — 5 new root causes (1 caught by you, 4 by code audit) + 3 cleared</w:t>
       </w:r>
     </w:p>
     <w:p>
@@ -5742,7 +5742,69 @@
           <w:sz w:val="22"/>
           <w:szCs w:val="22"/>
         </w:rPr>
-        <w:t xml:space="preserve">You asked for at least 5-6 more root causes. Three parallel code audits examined every surface where COA, Notes, and Face could diverge. Result: 4 REAL latent vectors (closed in commit b9fcbfbb) + 3 audited-and-cleared areas (no bug, verified safe). That's 7 surfaces examined in depth.</w:t>
+        <w:t xml:space="preserve">You asked for at least 5-6 more root causes. Result: 5 REAL vectors closed (commits b9fcbfbb + c06c0a5c) + 3 audited-and-cleared areas. 8 surfaces examined in depth.</w:t>
+      </w:r>
+    </w:p>
+    <w:p>
+      <w:pPr>
+        <w:pStyle w:val="Heading2"/>
+        <w:spacing w:after="140" w:before="180"/>
+      </w:pPr>
+      <w:r>
+        <w:rPr>
+          <w:rFonts w:ascii="Arial" w:cs="Arial" w:eastAsia="Arial" w:hAnsi="Arial"/>
+          <w:b/>
+          <w:bCs/>
+          <w:color w:val="1F4E79"/>
+          <w:sz w:val="26"/>
+          <w:szCs w:val="26"/>
+        </w:rPr>
+        <w:t xml:space="preserve">RC-10 (ACTIVE — the BHAKTI INFRA mismatch you screenshotted)</w:t>
+      </w:r>
+    </w:p>
+    <w:p>
+      <w:pPr>
+        <w:spacing w:after="100"/>
+        <w:jc w:val="left"/>
+      </w:pPr>
+      <w:r>
+        <w:rPr>
+          <w:rFonts w:ascii="Arial" w:cs="Arial" w:eastAsia="Arial" w:hAnsi="Arial"/>
+          <w:sz w:val="22"/>
+          <w:szCs w:val="22"/>
+        </w:rPr>
+        <w:t xml:space="preserve">Borrowings is a Long-Term/Short-Term split note (Pattern A): every row value is stored under _lt / _st suffixed keys, and the Notes UI renderer reads ONLY suffixed keys. The COA Reconciliation Adjustment was written as a BARE key — the canonical aggregator picked it up via a fallback (so the BS face and the health panel showed "reconciled"), but the renderer displayed the row blank and excluded it from the on-screen total. You saw ₹3,74,94,223 on the note vs ₹73,30,715 on the face — both "correct" by their own reader, disagreeing on screen.</w:t>
+      </w:r>
+    </w:p>
+    <w:p>
+      <w:pPr>
+        <w:spacing w:after="100"/>
+        <w:jc w:val="left"/>
+      </w:pPr>
+      <w:r>
+        <w:rPr>
+          <w:rFonts w:ascii="Arial" w:cs="Arial" w:eastAsia="Arial" w:hAnsi="Arial"/>
+          <w:color w:val="008000"/>
+          <w:sz w:val="22"/>
+          <w:szCs w:val="22"/>
+        </w:rPr>
+        <w:t xml:space="preserve">Fix: one-time migration moved the value to coa_reconcile_balance_lt on all 4 affected notes (BHAKTI, MAHIL, AMBER GUM, SHRI RAM); the fix-SQL template now always writes suffixed keys for Pattern A note types. Verified live after the fix: BHAKTI Note 3 grand total reads ₹73,30,715 CY / ₹2,61,15,547 PY — identical to the BS face, with the adjustment row now visible.</w:t>
+      </w:r>
+    </w:p>
+    <w:p>
+      <w:pPr>
+        <w:spacing w:after="100"/>
+        <w:jc w:val="left"/>
+      </w:pPr>
+      <w:r>
+        <w:rPr>
+          <w:rFonts w:ascii="Arial" w:cs="Arial" w:eastAsia="Arial" w:hAnsi="Arial"/>
+          <w:i/>
+          <w:iCs/>
+          <w:sz w:val="22"/>
+          <w:szCs w:val="22"/>
+        </w:rPr>
+        <w:t xml:space="preserve">Lesson encoded: "reconciled" must mean ALL FOUR readers agree — canonical aggregator, BS face, health panel, AND the renderer the auditor actually looks at. The renderer was the missing fourth check.</w:t>
       </w:r>
     </w:p>
     <w:p>

</xml_diff>